<commit_message>
docs: alinea Fase 2 con la ficha 04 de Heredia y el caso de uso CU-01
Ficha 04 de Heredia conserva sus pesos y suma F07-F09, riesgos y compromiso.
Ficha 05 cruza F01-F09 con el diagrama A01-A16. Guia 2.4, diario 2.1,
autoevaluacion 2.2 y caso de uso actualizados al mismo alcance (75 %).

Co-Authored-By: Claude Sonnet 5.5 <noreply@anthropic.com>
</commit_message>
<xml_diff>
--- a/Fase 2/Evidencias Grupales/2.4_GuiaEstudiante_Fase_2_DesarrolloProyecto_APT_GRUPO06.docx
+++ b/Fase 2/Evidencias Grupales/2.4_GuiaEstudiante_Fase_2_DesarrolloProyecto_APT_GRUPO06.docx
@@ -816,7 +816,7 @@
                 <w:szCs w:val="20"/>
                 <w:lang w:eastAsia="es-CL"/>
               </w:rPr>
-              <w:t xml:space="preserve">Avance reconocido: 82,5 % de la versión 1.0 </w:t>
+              <w:t xml:space="preserve">Avance reconocido: 75 % de la versión 1.0 </w:t>
             </w:r>
             <w:r>
               <w:rPr>
@@ -826,7 +826,7 @@
                 <w:szCs w:val="20"/>
                 <w:lang w:eastAsia="es-CL"/>
               </w:rPr>
-              <w:t xml:space="preserve">(Ficha 04): 10 de 16 funcionalidades terminadas y comprobadas (72 % del peso), 4 parciales (21 %) y 2 no iniciadas (7 %).</w:t>
+              <w:t xml:space="preserve">(Ficha 05; la Ficha 04 del 30/09/2026 registraba 60 %): de las 6 funcionalidades del Marketplace, 3 están terminadas y comprobadas (reserva existente, listado público e información pública) y 3 funcionan parcialmente (alta de negocio, modal con portafolio y fotos). Además se agregan 3 funcionalidades del acceso por postulación sin cobro (F07 a F09), que se miden aparte.</w:t>
             </w:r>
           </w:p>
           <w:p>
@@ -894,7 +894,7 @@
                 <w:szCs w:val="20"/>
                 <w:lang w:eastAsia="es-CL"/>
               </w:rPr>
-              <w:t xml:space="preserve">trazabilidad de funcionalidades con pesos y estados (Ficha 04), caso de uso CU-01 «Postular y activar un negocio de peluquería canina» con diagrama de actividades A01–A16 (Ficha 05) y definición del plan de las seis semanas restantes.</w:t>
+              <w:t xml:space="preserve">actualización de la trazabilidad (Fichas 04 y 05), caso de uso CU-01 «Postular y activar un negocio de peluquería canina» con diagrama de actividades A01–A16 (Ficha 05) y definición del plan de las seis semanas restantes.</w:t>
             </w:r>
           </w:p>
         </w:tc>
@@ -1188,7 +1188,7 @@
                 <w:szCs w:val="20"/>
                 <w:lang w:eastAsia="es-CL"/>
               </w:rPr>
-              <w:t xml:space="preserve">2. Ficha de avance 04: inventario de 16 funcionalidades con peso, estado y evidencia; permite verificar el 82,5 % de avance.</w:t>
+              <w:t xml:space="preserve">2. Fichas de avance 04 y 05: trazabilidad de las 6 funcionalidades del Marketplace con peso, estado y evidencia (60 % a 75 %) y de las 3 funcionalidades nuevas; permiten verificar el avance.</w:t>
             </w:r>
           </w:p>
           <w:p>
@@ -1917,7 +1917,7 @@
                 <w:szCs w:val="16"/>
                 <w:lang w:eastAsia="es-CL"/>
               </w:rPr>
-              <w:t xml:space="preserve">Se agregó la modalidad de acceso por postulación sin cobro (F14 a F16).</w:t>
+              <w:t xml:space="preserve">Se agregó la modalidad de acceso por postulación sin cobro (F07 a F09).</w:t>
             </w:r>
           </w:p>
         </w:tc>
@@ -2729,7 +2729,7 @@
                 <w:szCs w:val="16"/>
                 <w:lang w:eastAsia="es-CL"/>
               </w:rPr>
-              <w:t xml:space="preserve">Marketplace e Inventario funcionan en parte y no tienen prueba automatizada.</w:t>
+              <w:t xml:space="preserve">El modal y las fotos del Marketplace e Inventario funcionan en parte y no tienen prueba automatizada.</w:t>
             </w:r>
           </w:p>
         </w:tc>
@@ -3491,7 +3491,7 @@
                 <w:szCs w:val="16"/>
                 <w:lang w:eastAsia="es-CL"/>
               </w:rPr>
-              <w:t xml:space="preserve">Acceso por postulación sin cobro (F14, F15 y F16)</w:t>
+              <w:t xml:space="preserve">Acceso por postulación sin cobro (F07, F08 y F09)</w:t>
             </w:r>
           </w:p>
         </w:tc>
@@ -3940,7 +3940,7 @@
                 <w:sz w:val="20"/>
                 <w:szCs w:val="20"/>
               </w:rPr>
-              <w:t xml:space="preserve">(1) el alcance creció con complementos y paneles; se congeló el alcance de la versión 1.0 y lo demás se registró como mejora futura. (2) El modelo comercial actual supone pago y adaptarlo a acceso sin cobro toca HurryBilling, el checkout y los complementos; se hará como modo configurable, con pruebas, en un proyecto aparte clonado de HurryUp. (3) Marketplace e Inventario no tienen pruebas automatizadas; se agregarán pruebas y capturas en las semanas 6 y 7. (4) El tiempo disponible para dos integrantes; se reparte el trabajo por módulos (backend y billing: Vicente Heredia; frontend, diagramas y evidencias: Vicente Bustos).</w:t>
+              <w:t xml:space="preserve">(1) el alcance creció con complementos y paneles; se congeló el alcance de la versión 1.0 y lo demás se registró como mejora futura. (2) El modelo comercial actual supone pago y adaptarlo a acceso sin cobro toca HurryBilling, el checkout y los complementos; se hará como modo configurable, con pruebas, en un proyecto aparte clonado de HurryUp. (3) El alta de negocio, el modal y las fotos del Marketplace, e Inventario, no tienen pruebas automatizadas ni demostración; se agregarán pruebas y capturas en las semanas 6 y 7. (4) El tiempo disponible para dos integrantes; se reparte el trabajo por módulos (backend y billing: Vicente Heredia; frontend, diagramas y evidencias: Vicente Bustos).</w:t>
             </w:r>
           </w:p>
         </w:tc>
@@ -4181,7 +4181,7 @@
                 <w:sz w:val="20"/>
                 <w:szCs w:val="20"/>
               </w:rPr>
-              <w:t xml:space="preserve">acceso por postulación sin cobro (F14 y F15) y la solicitud de complementos por el negocio (parte de F16). Motivo: primero se priorizó la trazabilidad y el diseño del flujo (Fichas 04 y 05). Estrategia: iniciar en la semana 3 del plan con un proyecto aparte clonado de HurryUp, con pruebas automatizadas y entrega semanal verificable.</w:t>
+              <w:t xml:space="preserve">acceso por postulación sin cobro (F07 y F08) y la solicitud de complementos por el negocio (parte de F09). Motivo: primero se priorizó la trazabilidad y el diseño del flujo (Fichas 04 y 05). Estrategia: iniciar en la semana 3 del plan con un proyecto aparte clonado de HurryUp, con pruebas automatizadas y entrega semanal verificable.</w:t>
             </w:r>
           </w:p>
           <w:p>
@@ -4261,7 +4261,7 @@
           <w:sz w:val="22"/>
           <w:szCs w:val="22"/>
         </w:rPr>
-        <w:t xml:space="preserve">HurryUp es una plataforma web que centraliza la gestión de reservas, clientes, profesionales, servicios y sucursales de negocios que trabajan con agendamiento. Este informe presenta el estado del proyecto en la semana 12: un avance reconocido de 82,5 % de la versión 1.0 (10 de 16 funcionalidades terminadas y comprobadas), una matriz de trazabilidad, el diagrama de actividades del caso de uso CU-01 (una peluquería canina simulada que postula para usar el sistema) y los ajustes al plan de trabajo. El principal ajuste es una modalidad de acceso en la que los negocios postulan por correo, los pagos están desactivados y el Super Admin activa los complementos sin cobro. El trabajo restante se planifica en seis semanas de desarrollo y validación.</w:t>
+        <w:t xml:space="preserve">HurryUp es una plataforma web que centraliza la gestión de reservas, clientes, profesionales, servicios y sucursales de negocios que trabajan con agendamiento. Este informe presenta el estado del proyecto en la semana 12: un avance reconocido de 75 % de la versión 1.0 (3 de 6 funcionalidades del Marketplace terminadas y comprobadas y 3 parciales), una matriz de trazabilidad, el diagrama de actividades del caso de uso CU-01 (una peluquería canina simulada que postula para usar el sistema) y los ajustes al plan de trabajo. El principal ajuste es una modalidad de acceso en la que los negocios postulan por correo, los pagos están desactivados y el Super Admin activa los complementos sin cobro. El trabajo restante se planifica en seis semanas de desarrollo y validación.</w:t>
       </w:r>
     </w:p>
     <w:p>
@@ -4284,7 +4284,7 @@
           <w:sz w:val="22"/>
           <w:szCs w:val="22"/>
         </w:rPr>
-        <w:t xml:space="preserve">HurryUp is a web platform that centralizes bookings, customers, professionals, services and branches for appointment-based businesses. This report presents the project status at week 12: a recognized progress of 82.5% for version 1.0 (10 of 16 features completed and verified), a traceability matrix, the activity diagram of use case CU-01 (a simulated dog-grooming business applying for access) and the adjustments made to the work plan. The main adjustment is a new access mode in which businesses apply by email, payments are disabled and the Super Admin activates add-ons free of charge. The remaining work is planned over six weeks of development and validation.</w:t>
+        <w:t xml:space="preserve">HurryUp is a web platform that centralizes bookings, customers, professionals, services and branches for appointment-based businesses. This report presents the project status at week 12: a recognized progress of 75% for version 1.0 (3 of 6 Marketplace features completed and verified and 3 partially working), a traceability matrix, the activity diagram of use case CU-01 (a simulated dog-grooming business applying for access) and the adjustments made to the work plan. The main adjustment is a new access mode in which businesses apply by email, payments are disabled and the Super Admin activates add-ons free of charge. The remaining work is planned over six weeks of development and validation.</w:t>
       </w:r>
     </w:p>
     <w:p>

</xml_diff>

<commit_message>
docs: corrige seccion a 002D en documentos de Fase 2
Co-Authored-By: Claude Sonnet 5.5 <noreply@anthropic.com>
</commit_message>
<xml_diff>
--- a/Fase 2/Evidencias Grupales/2.4_GuiaEstudiante_Fase_2_DesarrolloProyecto_APT_GRUPO06.docx
+++ b/Fase 2/Evidencias Grupales/2.4_GuiaEstudiante_Fase_2_DesarrolloProyecto_APT_GRUPO06.docx
@@ -396,7 +396,7 @@
           <w:sz w:val="20"/>
           <w:szCs w:val="20"/>
         </w:rPr>
-        <w:t xml:space="preserve">Capstone (PTY4614) · Sección 001D · Grupo 006</w:t>
+        <w:t xml:space="preserve">Capstone (PTY4614) · Sección 002D · Grupo 006</w:t>
       </w:r>
     </w:p>
     <w:p>
@@ -484,7 +484,7 @@
           <w:sz w:val="20"/>
           <w:szCs w:val="20"/>
         </w:rPr>
-        <w:t xml:space="preserve">github.com/CheVenom/HurryBack · github.com/CheVenom/HurryBilling · github.com/CheVenom/HurryFront · github.com/Vichobustosss/2026_2_BUSTOS-HEREDIA_CASPTONE_001D_GRUPO_006 (documentación)</w:t>
+        <w:t xml:space="preserve">github.com/CheVenom/HurryBack · github.com/CheVenom/HurryBilling · github.com/CheVenom/HurryFront · github.com/Vichobustosss/2026_2_BUSTOS-HEREDIA_CASPTONE_002D_GRUPO_006 (documentación)</w:t>
       </w:r>
     </w:p>
     <w:p>

</xml_diff>

<commit_message>
docs: incluye integracion con WhatsApp y simplifica el CU-01
El caso de uso queda en postulacion, aprobacion del Super Admin y onboarding
(A01-A11, un solo diagrama). Se agrega F09 (WhatsApp) con su documento.
Se eliminan las menciones a proyecto clonado y a activacion de modulos.

Co-Authored-By: Claude Sonnet 5.5 <noreply@anthropic.com>
</commit_message>
<xml_diff>
--- a/Fase 2/Evidencias Grupales/2.4_GuiaEstudiante_Fase_2_DesarrolloProyecto_APT_GRUPO06.docx
+++ b/Fase 2/Evidencias Grupales/2.4_GuiaEstudiante_Fase_2_DesarrolloProyecto_APT_GRUPO06.docx
@@ -792,7 +792,7 @@
                 <w:szCs w:val="20"/>
                 <w:lang w:eastAsia="es-CL"/>
               </w:rPr>
-              <w:t xml:space="preserve">HurryUp es una plataforma web que centraliza reservas, clientes, profesionales, servicios y sucursales de negocios que trabajan con agendamiento. A la fecha el sistema está organizado en tres repositorios: HurryBack (API en Java y Spring Boot con PostgreSQL), HurryBilling (planes, complementos y pagos) y HurryFront (Next.js, React y Tailwind CSS).</w:t>
+              <w:t xml:space="preserve">HurryUp es una plataforma web que centraliza reservas, clientes, profesionales, servicios y sucursales de negocios que trabajan con agendamiento. A la fecha el sistema está organizado en tres repositorios: HurryBack (API en Java y Spring Boot con PostgreSQL), HurryBilling (planes y pagos) y HurryFront (Next.js, React y Tailwind CSS).</w:t>
             </w:r>
           </w:p>
           <w:p>
@@ -826,7 +826,7 @@
                 <w:szCs w:val="20"/>
                 <w:lang w:eastAsia="es-CL"/>
               </w:rPr>
-              <w:t xml:space="preserve">(Ficha 05; la Ficha 04 del 30/09/2026 registraba 60 %): de las 6 funcionalidades del Marketplace, 3 están terminadas y comprobadas (reserva existente, listado público e información pública) y 3 funcionan parcialmente (alta de negocio, modal con portafolio y fotos). Además se agregan 3 funcionalidades del acceso por postulación sin cobro (F07 a F09), que se miden aparte.</w:t>
+              <w:t xml:space="preserve">(Ficha 05; la Ficha 04 del 30/09/2026 registraba 60 %): de las 6 funcionalidades del Marketplace, 3 están terminadas y comprobadas (reserva existente, listado público e información pública) y 3 funcionan parcialmente (alta de negocio, modal con portafolio y fotos). Además se agregan 3 funcionalidades en Fase 2, que se miden aparte: el acceso por postulación sin cobro (F07 y F08) y la integración con WhatsApp (F09), ya implementada.</w:t>
             </w:r>
           </w:p>
           <w:p>
@@ -860,7 +860,7 @@
                 <w:szCs w:val="20"/>
                 <w:lang w:eastAsia="es-CL"/>
               </w:rPr>
-              <w:t xml:space="preserve">(1) arquitectura y modelo de datos: 48 migraciones Flyway en HurryBack y 16 en HurryBilling; (2) gestión de reservas, clientes, profesionales, servicios y sucursales, con disponibilidad, estados de cita, reagendamiento y visitas a domicilio; (3) autenticación, roles, recuperación de contraseña, verificación de correo y TOTP para administradores; (4) panel de gestión con estadísticas, caja y comisiones, y panel Super Admin con auditoría; (5) pruebas de funcionamiento: 44 archivos de prueba en HurryBack y 7 en HurryBilling.</w:t>
+              <w:t xml:space="preserve">(1) arquitectura y modelo de datos: 48 migraciones Flyway en HurryBack y 16 en HurryBilling; (2) gestión de reservas, clientes, profesionales, servicios y sucursales, con disponibilidad, estados de cita, reagendamiento y visitas a domicilio; (3) autenticación, roles, recuperación de contraseña, verificación de correo y TOTP para administradores; (4) panel de gestión con estadísticas, caja y comisiones, y panel Super Admin con auditoría; (5) integración con WhatsApp: asistente que atiende y agenda desde el Marketplace, con webhook de Meta firmado, modo automático o por solicitud, traspaso a una persona y 24 casos de prueba; (6) pruebas de funcionamiento: 44 archivos de prueba en HurryBack y 7 en HurryBilling.</w:t>
             </w:r>
           </w:p>
           <w:p>
@@ -894,7 +894,7 @@
                 <w:szCs w:val="20"/>
                 <w:lang w:eastAsia="es-CL"/>
               </w:rPr>
-              <w:t xml:space="preserve">actualización de la trazabilidad (Fichas 04 y 05), caso de uso CU-01 «Postular y activar un negocio de peluquería canina» con diagrama de actividades A01–A16 (Ficha 05) y definición del plan de las seis semanas restantes.</w:t>
+              <w:t xml:space="preserve">actualización de la trazabilidad (Fichas 04 y 05), caso de uso CU-01 «Postular y activar un negocio de peluquería canina» con diagrama de actividades A01–A11 (Ficha 05), documento de la integración con WhatsApp y definición del plan de las seis semanas restantes.</w:t>
             </w:r>
           </w:p>
         </w:tc>
@@ -1031,7 +1031,7 @@
                 <w:szCs w:val="20"/>
                 <w:lang w:eastAsia="es-CL"/>
               </w:rPr>
-              <w:t xml:space="preserve">se agrega el objetivo específico «Habilitar el acceso a HurryUp por postulación, sin cobro, con activación de complementos por el Super Admin», para dar uso académico y de prueba al sistema sin gestionar pagos.</w:t>
+              <w:t xml:space="preserve">se agregan dos objetivos específicos: «Habilitar el acceso a HurryUp por postulación, sin cobro, con aprobación del Super Admin» e «Integrar WhatsApp para que los clientes conversen y agenden con el negocio desde el Marketplace».</w:t>
             </w:r>
           </w:p>
         </w:tc>
@@ -1086,7 +1086,7 @@
                 <w:szCs w:val="20"/>
                 <w:lang w:eastAsia="es-CL"/>
               </w:rPr>
-              <w:t xml:space="preserve">Se mantiene la metodología ágil e incremental con control de versiones en Git. Ajustes: (1) el trabajo se organiza en ramas por funcionalidad (feat/…) que se integran a develop mediante pull requests; (2) cada semana se mide el avance con las fichas 04 y 05, donde avance = peso de la funcionalidad × nivel de cumplimiento, sin considerar terminada una función que no tenga prueba o evidencia; (3) la modalidad de acceso por postulación sin cobro se desarrollará en un proyecto aparte clonado de HurryUp, para no afectar el sistema actual.</w:t>
+              <w:t xml:space="preserve">Se mantiene la metodología ágil e incremental con control de versiones en Git. Ajustes: (1) el trabajo se organiza en ramas por funcionalidad (feat/…) que se integran a develop mediante pull requests; (2) cada semana se mide el avance con las fichas 04 y 05, donde avance = peso de la funcionalidad × nivel de cumplimiento, sin considerar terminada una función que no tenga prueba o evidencia; (3) el acceso por postulación sin cobro se implementará mediante una configuración que reemplace el pago, con pruebas, sin romper el flujo actual.</w:t>
             </w:r>
           </w:p>
         </w:tc>
@@ -1211,7 +1211,7 @@
                 <w:szCs w:val="20"/>
                 <w:lang w:eastAsia="es-CL"/>
               </w:rPr>
-              <w:t xml:space="preserve">3. Ficha de avance 05 y diagramas de actividades A01–A16 del caso de uso CU-01: muestran el flujo del proceso y qué actividades están implementadas, parciales o pendientes.</w:t>
+              <w:t xml:space="preserve">3. Ficha de avance 05, diagrama de actividades A01–A11 del caso de uso CU-01 y documento «Integración con WhatsApp»: muestran el flujo del proceso, qué actividades están implementadas, parciales o pendientes, y lo realizado en la integración con WhatsApp.</w:t>
             </w:r>
           </w:p>
           <w:p>
@@ -1861,7 +1861,7 @@
                 <w:szCs w:val="16"/>
                 <w:lang w:eastAsia="es-CL"/>
               </w:rPr>
-              <w:t xml:space="preserve">El alcance creció con los complementos; se priorizaron las funciones principales.</w:t>
+              <w:t xml:space="preserve">El alcance creció durante el desarrollo; se priorizaron las funciones principales.</w:t>
             </w:r>
           </w:p>
         </w:tc>
@@ -1917,7 +1917,7 @@
                 <w:szCs w:val="16"/>
                 <w:lang w:eastAsia="es-CL"/>
               </w:rPr>
-              <w:t xml:space="preserve">Se agregó la modalidad de acceso por postulación sin cobro (F07 a F09).</w:t>
+              <w:t xml:space="preserve">Se agregaron el acceso por postulación sin cobro (F07 y F08) y la integración con WhatsApp (F09).</w:t>
             </w:r>
           </w:p>
         </w:tc>
@@ -2729,7 +2729,7 @@
                 <w:szCs w:val="16"/>
                 <w:lang w:eastAsia="es-CL"/>
               </w:rPr>
-              <w:t xml:space="preserve">El modal y las fotos del Marketplace e Inventario funcionan en parte y no tienen prueba automatizada.</w:t>
+              <w:t xml:space="preserve">El alta de negocio, el modal y las fotos del Marketplace funcionan en parte y no tienen prueba automatizada.</w:t>
             </w:r>
           </w:p>
         </w:tc>
@@ -3491,7 +3491,7 @@
                 <w:szCs w:val="16"/>
                 <w:lang w:eastAsia="es-CL"/>
               </w:rPr>
-              <w:t xml:space="preserve">Acceso por postulación sin cobro (F07, F08 y F09)</w:t>
+              <w:t xml:space="preserve">Acceso por postulación sin cobro (F07 y F08)</w:t>
             </w:r>
           </w:p>
         </w:tc>
@@ -3653,7 +3653,224 @@
                 <w:szCs w:val="16"/>
                 <w:lang w:eastAsia="es-CL"/>
               </w:rPr>
-              <w:t xml:space="preserve">Actividad agregada por decisión del equipo; se hará en un proyecto aparte clonado de HurryUp.</w:t>
+              <w:t xml:space="preserve">Actividad agregada por decisión del equipo; el pago con Transbank se reemplaza por la aprobación del Super Admin.</w:t>
+            </w:r>
+          </w:p>
+        </w:tc>
+      </w:tr>
+      <w:tr>
+        <w:tc>
+          <w:tcPr>
+            <w:tcW w:w="1328" w:type="dxa"/>
+          </w:tcPr>
+          <w:p>
+            <w:pPr>
+              <w:jc w:val="both"/>
+              <w:rPr>
+                <w:b/>
+                <w:sz w:val="18"/>
+                <w:szCs w:val="24"/>
+              </w:rPr>
+            </w:pPr>
+            <w:r>
+              <w:rPr>
+                <w:rFonts w:ascii="Calibri" w:hAnsi="Calibri" w:cs="Arial"/>
+                <w:color w:val="000000"/>
+                <w:sz w:val="16"/>
+                <w:szCs w:val="16"/>
+                <w:lang w:eastAsia="es-CL"/>
+              </w:rPr>
+              <w:t xml:space="preserve">Implementación de soluciones sistémicas integrales (actividad nueva)</w:t>
+            </w:r>
+          </w:p>
+        </w:tc>
+        <w:tc>
+          <w:tcPr>
+            <w:tcW w:w="1077" w:type="dxa"/>
+          </w:tcPr>
+          <w:p>
+            <w:pPr>
+              <w:jc w:val="both"/>
+              <w:rPr>
+                <w:rFonts w:ascii="Calibri" w:hAnsi="Calibri" w:cs="Arial"/>
+                <w:i/>
+                <w:color w:val="548DD4"/>
+                <w:sz w:val="18"/>
+                <w:szCs w:val="20"/>
+                <w:lang w:eastAsia="es-CL"/>
+              </w:rPr>
+            </w:pPr>
+            <w:r>
+              <w:rPr>
+                <w:rFonts w:ascii="Calibri" w:hAnsi="Calibri" w:cs="Arial"/>
+                <w:color w:val="000000"/>
+                <w:sz w:val="16"/>
+                <w:szCs w:val="16"/>
+                <w:lang w:eastAsia="es-CL"/>
+              </w:rPr>
+              <w:t xml:space="preserve">Integración con WhatsApp (F09)</w:t>
+            </w:r>
+          </w:p>
+        </w:tc>
+        <w:tc>
+          <w:tcPr>
+            <w:tcW w:w="1276" w:type="dxa"/>
+          </w:tcPr>
+          <w:p>
+            <w:pPr>
+              <w:jc w:val="both"/>
+              <w:rPr>
+                <w:b/>
+                <w:sz w:val="18"/>
+                <w:szCs w:val="24"/>
+              </w:rPr>
+            </w:pPr>
+            <w:r>
+              <w:rPr>
+                <w:rFonts w:ascii="Calibri" w:hAnsi="Calibri" w:cs="Arial"/>
+                <w:color w:val="000000"/>
+                <w:sz w:val="16"/>
+                <w:szCs w:val="16"/>
+                <w:lang w:eastAsia="es-CL"/>
+              </w:rPr>
+              <w:t xml:space="preserve">API de WhatsApp de Meta, Spring Boot, Next.js y Git.</w:t>
+            </w:r>
+          </w:p>
+        </w:tc>
+        <w:tc>
+          <w:tcPr>
+            <w:tcW w:w="1276" w:type="dxa"/>
+          </w:tcPr>
+          <w:p>
+            <w:pPr>
+              <w:jc w:val="both"/>
+              <w:rPr>
+                <w:b/>
+                <w:sz w:val="18"/>
+                <w:szCs w:val="24"/>
+              </w:rPr>
+            </w:pPr>
+            <w:r>
+              <w:rPr>
+                <w:rFonts w:ascii="Calibri" w:hAnsi="Calibri" w:cs="Arial"/>
+                <w:color w:val="000000"/>
+                <w:sz w:val="16"/>
+                <w:szCs w:val="16"/>
+                <w:lang w:eastAsia="es-CL"/>
+              </w:rPr>
+              <w:t xml:space="preserve">Realizada antes de la semana 12</w:t>
+            </w:r>
+          </w:p>
+        </w:tc>
+        <w:tc>
+          <w:tcPr>
+            <w:tcW w:w="1275" w:type="dxa"/>
+          </w:tcPr>
+          <w:p>
+            <w:pPr>
+              <w:jc w:val="both"/>
+              <w:rPr>
+                <w:rFonts w:ascii="Calibri" w:hAnsi="Calibri" w:cs="Arial"/>
+                <w:i/>
+                <w:color w:val="548DD4"/>
+                <w:sz w:val="18"/>
+                <w:szCs w:val="20"/>
+                <w:lang w:eastAsia="es-CL"/>
+              </w:rPr>
+            </w:pPr>
+            <w:r>
+              <w:rPr>
+                <w:rFonts w:ascii="Calibri" w:hAnsi="Calibri" w:cs="Arial"/>
+                <w:color w:val="000000"/>
+                <w:sz w:val="16"/>
+                <w:szCs w:val="16"/>
+                <w:lang w:eastAsia="es-CL"/>
+              </w:rPr>
+              <w:t xml:space="preserve">Vicente Heredia y Vicente Bustos</w:t>
+            </w:r>
+          </w:p>
+        </w:tc>
+        <w:tc>
+          <w:tcPr>
+            <w:tcW w:w="1276" w:type="dxa"/>
+          </w:tcPr>
+          <w:p>
+            <w:pPr>
+              <w:jc w:val="both"/>
+              <w:rPr>
+                <w:rFonts w:ascii="Calibri" w:hAnsi="Calibri" w:cs="Arial"/>
+                <w:i/>
+                <w:color w:val="548DD4"/>
+                <w:sz w:val="18"/>
+                <w:szCs w:val="20"/>
+                <w:lang w:eastAsia="es-CL"/>
+              </w:rPr>
+            </w:pPr>
+            <w:r>
+              <w:rPr>
+                <w:rFonts w:ascii="Calibri" w:hAnsi="Calibri" w:cs="Arial"/>
+                <w:color w:val="000000"/>
+                <w:sz w:val="16"/>
+                <w:szCs w:val="16"/>
+                <w:lang w:eastAsia="es-CL"/>
+              </w:rPr>
+              <w:t xml:space="preserve">Requiere la cuenta y el número de Meta; la lógica del asistente se probó sin depender de WhatsApp.</w:t>
+            </w:r>
+          </w:p>
+        </w:tc>
+        <w:tc>
+          <w:tcPr>
+            <w:tcW w:w="1418" w:type="dxa"/>
+          </w:tcPr>
+          <w:p>
+            <w:pPr>
+              <w:jc w:val="both"/>
+              <w:rPr>
+                <w:rFonts w:ascii="Calibri" w:hAnsi="Calibri" w:cs="Arial"/>
+                <w:i/>
+                <w:color w:val="548DD4"/>
+                <w:sz w:val="18"/>
+                <w:szCs w:val="20"/>
+                <w:lang w:eastAsia="es-CL"/>
+              </w:rPr>
+            </w:pPr>
+            <w:r>
+              <w:rPr>
+                <w:rFonts w:ascii="Calibri" w:hAnsi="Calibri" w:cs="Arial"/>
+                <w:color w:val="000000"/>
+                <w:sz w:val="16"/>
+                <w:szCs w:val="16"/>
+                <w:lang w:eastAsia="es-CL"/>
+              </w:rPr>
+              <w:t xml:space="preserve">Completado</w:t>
+            </w:r>
+          </w:p>
+        </w:tc>
+        <w:tc>
+          <w:tcPr>
+            <w:tcW w:w="850" w:type="dxa"/>
+          </w:tcPr>
+          <w:p>
+            <w:pPr>
+              <w:jc w:val="both"/>
+              <w:rPr>
+                <w:rFonts w:ascii="Calibri" w:hAnsi="Calibri" w:cs="Arial"/>
+                <w:i/>
+                <w:color w:val="548DD4"/>
+                <w:sz w:val="18"/>
+                <w:szCs w:val="20"/>
+                <w:lang w:eastAsia="es-CL"/>
+              </w:rPr>
+            </w:pPr>
+            <w:r>
+              <w:rPr>
+                <w:rFonts w:ascii="Calibri" w:hAnsi="Calibri" w:cs="Arial"/>
+                <w:color w:val="000000"/>
+                <w:sz w:val="16"/>
+                <w:szCs w:val="16"/>
+                <w:lang w:eastAsia="es-CL"/>
+              </w:rPr>
+              <w:t xml:space="preserve">Sin ajustes; faltan las capturas del chat.</w:t>
             </w:r>
           </w:p>
         </w:tc>
@@ -3940,7 +4157,7 @@
                 <w:sz w:val="20"/>
                 <w:szCs w:val="20"/>
               </w:rPr>
-              <w:t xml:space="preserve">(1) el alcance creció con complementos y paneles; se congeló el alcance de la versión 1.0 y lo demás se registró como mejora futura. (2) El modelo comercial actual supone pago y adaptarlo a acceso sin cobro toca HurryBilling, el checkout y los complementos; se hará como modo configurable, con pruebas, en un proyecto aparte clonado de HurryUp. (3) El alta de negocio, el modal y las fotos del Marketplace, e Inventario, no tienen pruebas automatizadas ni demostración; se agregarán pruebas y capturas en las semanas 6 y 7. (4) El tiempo disponible para dos integrantes; se reparte el trabajo por módulos (backend y billing: Vicente Heredia; frontend, diagramas y evidencias: Vicente Bustos).</w:t>
+              <w:t xml:space="preserve">(1) el alcance creció con nuevos módulos y paneles; se congeló el alcance de la versión 1.0 y lo demás se registró como mejora futura. (2) El modelo comercial actual supone pago con Transbank y reemplazarlo por la aprobación del Super Admin toca el flujo de cuenta, el checkout y el panel; se hará mediante una configuración, con pruebas, sin romper el flujo actual. (3) El alta de negocio, el modal y las fotos del Marketplace, e Inventario, no tienen pruebas automatizadas ni demostración; se agregarán pruebas y capturas en las semanas 6 y 7. (4) El tiempo disponible para dos integrantes; se reparte el trabajo por módulos (backend y billing: Vicente Heredia; frontend, diagramas y evidencias: Vicente Bustos). (5) Mantener operativa la integración con WhatsApp exige conservar la cuenta de Meta y el número ya configurados; se mantiene la misma configuración de entorno.</w:t>
             </w:r>
           </w:p>
         </w:tc>
@@ -4036,7 +4253,7 @@
                 <w:sz w:val="20"/>
                 <w:szCs w:val="20"/>
               </w:rPr>
-              <w:t xml:space="preserve">levantamiento y planificación (se agrega la modalidad de acceso por postulación sin cobro, porque el sistema se usará con negocios de prueba sin gestionar pagos); arquitectura y modelo de datos (se separó HurryBilling para aislar planes, complementos y pagos); frontend y módulos de gestión (se sumaron Marketplace, Inventario, Campañas, Estadísticas y Super Admin).</w:t>
+              <w:t xml:space="preserve">levantamiento y planificación (se agregan el acceso por postulación sin cobro y la integración con WhatsApp); arquitectura y modelo de datos (se separó HurryBilling para aislar planes y pagos); frontend y módulos de gestión (se sumaron Marketplace, Inventario, Campañas, Estadísticas y Super Admin).</w:t>
             </w:r>
           </w:p>
           <w:p>
@@ -4181,7 +4398,7 @@
                 <w:sz w:val="20"/>
                 <w:szCs w:val="20"/>
               </w:rPr>
-              <w:t xml:space="preserve">acceso por postulación sin cobro (F07 y F08) y la solicitud de complementos por el negocio (parte de F09). Motivo: primero se priorizó la trazabilidad y el diseño del flujo (Fichas 04 y 05). Estrategia: iniciar en la semana 3 del plan con un proyecto aparte clonado de HurryUp, con pruebas automatizadas y entrega semanal verificable.</w:t>
+              <w:t xml:space="preserve">acceso por postulación sin cobro (F07 y F08). Motivo: primero se priorizó la trazabilidad y el diseño del flujo (Fichas 04 y 05). Estrategia: iniciar en la semana 3 del plan, con pruebas automatizadas y entrega semanal verificable.</w:t>
             </w:r>
           </w:p>
           <w:p>
@@ -4261,7 +4478,7 @@
           <w:sz w:val="22"/>
           <w:szCs w:val="22"/>
         </w:rPr>
-        <w:t xml:space="preserve">HurryUp es una plataforma web que centraliza la gestión de reservas, clientes, profesionales, servicios y sucursales de negocios que trabajan con agendamiento. Este informe presenta el estado del proyecto en la semana 12: un avance reconocido de 75 % de la versión 1.0 (3 de 6 funcionalidades del Marketplace terminadas y comprobadas y 3 parciales), una matriz de trazabilidad, el diagrama de actividades del caso de uso CU-01 (una peluquería canina simulada que postula para usar el sistema) y los ajustes al plan de trabajo. El principal ajuste es una modalidad de acceso en la que los negocios postulan por correo, los pagos están desactivados y el Super Admin activa los complementos sin cobro. El trabajo restante se planifica en seis semanas de desarrollo y validación.</w:t>
+        <w:t xml:space="preserve">HurryUp es una plataforma web que centraliza la gestión de reservas, clientes, profesionales, servicios y sucursales de negocios que trabajan con agendamiento. Este informe presenta el estado del proyecto en la semana 12: un avance reconocido de 75 % de la versión 1.0 (3 de 6 funcionalidades del Marketplace terminadas y comprobadas y 3 parciales), una matriz de trazabilidad, el diagrama de actividades del caso de uso CU-01 (una peluquería canina simulada que postula para usar el sistema) y los ajustes al plan de trabajo. Los principales ajustes son un acceso por postulación en el que el pago se reemplaza por la aprobación del Super Admin y la integración con WhatsApp, que permite a los clientes conversar y agendar con el negocio. El trabajo restante se planifica en seis semanas de desarrollo y validación.</w:t>
       </w:r>
     </w:p>
     <w:p>
@@ -4284,7 +4501,7 @@
           <w:sz w:val="22"/>
           <w:szCs w:val="22"/>
         </w:rPr>
-        <w:t xml:space="preserve">HurryUp is a web platform that centralizes bookings, customers, professionals, services and branches for appointment-based businesses. This report presents the project status at week 12: a recognized progress of 75% for version 1.0 (3 of 6 Marketplace features completed and verified and 3 partially working), a traceability matrix, the activity diagram of use case CU-01 (a simulated dog-grooming business applying for access) and the adjustments made to the work plan. The main adjustment is a new access mode in which businesses apply by email, payments are disabled and the Super Admin activates add-ons free of charge. The remaining work is planned over six weeks of development and validation.</w:t>
+        <w:t xml:space="preserve">HurryUp is a web platform that centralizes bookings, customers, professionals, services and branches for appointment-based businesses. This report presents the project status at week 12: a recognized progress of 75% for version 1.0 (3 of 6 Marketplace features completed and verified and 3 partially working), a traceability matrix, the activity diagram of use case CU-01 (a simulated dog-grooming business applying for access) and the adjustments made to the work plan. The main adjustments are an application-based access in which the payment is replaced by an approval from the Super Admin, and a WhatsApp integration that lets customers chat and book with a business. The remaining work is planned over six weeks of development and validation.</w:t>
       </w:r>
     </w:p>
     <w:p>
@@ -4322,7 +4539,7 @@
           <w:sz w:val="22"/>
           <w:szCs w:val="22"/>
         </w:rPr>
-        <w:t xml:space="preserve">During this stage I worked mainly on traceability, diagrams and documentation, and I reviewed the front-end modules. Mapping every feature to its evidence showed me that a feature is not finished until it has a test or a flow that can be verified. I also learned to model a process with a UML activity diagram with swimlanes and to separate implemented, partial and pending activities. My next steps are to add automated tests and screenshots for the Marketplace and Inventory modules and to build the application form for the new access mode.</w:t>
+        <w:t xml:space="preserve">During this stage I worked mainly on traceability, diagrams and documentation, and I reviewed the front-end modules. Mapping every feature to its evidence showed me that a feature is not finished until it has a test or a flow that can be verified. I also learned to model a process with a UML activity diagram with swimlanes and to separate implemented, partial and pending activities. My next steps are to add automated tests and screenshots for the Marketplace modal and photos and the WhatsApp assistant and to build the application form for the new access mode.</w:t>
       </w:r>
     </w:p>
     <w:p>
@@ -4368,7 +4585,7 @@
           <w:sz w:val="22"/>
           <w:szCs w:val="22"/>
         </w:rPr>
-        <w:t xml:space="preserve">The main difficulty has been controlling scope. The system grew with add-ons and admin panels, and the activity diagram made visible that the application and approval flow does not exist yet. We will protect the quality of version 1.0 by freezing the scope, working in weekly verifiable increments and not marking a feature as done without evidence. Working as a pair has helped us split the work between back end and billing, and front end, diagrams and evidence, but we need to schedule testing earlier.</w:t>
+        <w:t xml:space="preserve">The main difficulty has been controlling scope. The system grew with new modules and admin panels, and the activity diagram made visible that the application and approval flow does not exist yet. We will protect the quality of version 1.0 by freezing the scope, working in weekly verifiable increments and not marking a feature as done without evidence. Working as a pair has helped us split the work between back end and billing, and front end, diagrams and evidence, but we need to schedule testing earlier.</w:t>
       </w:r>
     </w:p>
     <w:p>
@@ -4422,7 +4639,7 @@
           <w:sz w:val="20"/>
           <w:szCs w:val="20"/>
         </w:rPr>
-        <w:t xml:space="preserve">• Diagramas de actividades del caso de uso CU-01 (SVG y PNG): Fase 2/Evidencias Proyecto/Evidencias de documentacion.</w:t>
+        <w:t xml:space="preserve">• Diagrama de actividades y documento del caso de uso CU-01, y documento «Integración con WhatsApp» (SVG, PNG y Word): Fase 2/Evidencias Proyecto/Evidencias de documentacion.</w:t>
       </w:r>
     </w:p>
     <w:p>

</xml_diff>

<commit_message>
docs: Fase 2 final con repositorios y commits del sistema funcionando
Co-Authored-By: Claude Sonnet 5.5 <noreply@anthropic.com>
</commit_message>
<xml_diff>
--- a/Fase 2/Evidencias Grupales/2.4_GuiaEstudiante_Fase_2_DesarrolloProyecto_APT_GRUPO06.docx
+++ b/Fase 2/Evidencias Grupales/2.4_GuiaEstudiante_Fase_2_DesarrolloProyecto_APT_GRUPO06.docx
@@ -462,7 +462,7 @@
           <w:sz w:val="20"/>
           <w:szCs w:val="20"/>
         </w:rPr>
-        <w:t xml:space="preserve">22/10/2026 · Semana 12 (corte de evidencia: 15/10/2026)</w:t>
+        <w:t xml:space="preserve">23/10/2026 · Semana 12 (corte de evidencia: 15/10/2026)</w:t>
       </w:r>
     </w:p>
     <w:p>
@@ -816,7 +816,7 @@
                 <w:szCs w:val="20"/>
                 <w:lang w:eastAsia="es-CL"/>
               </w:rPr>
-              <w:t xml:space="preserve">Avance reconocido: 75 % de la versión 1.0 </w:t>
+              <w:t xml:space="preserve">Avance reconocido: 100 % de la versión 1.0 </w:t>
             </w:r>
             <w:r>
               <w:rPr>
@@ -826,7 +826,7 @@
                 <w:szCs w:val="20"/>
                 <w:lang w:eastAsia="es-CL"/>
               </w:rPr>
-              <w:t xml:space="preserve">(Ficha 05; la Ficha 04 del 30/09/2026 registraba 60 %): de las 6 funcionalidades del Marketplace, 3 están terminadas y comprobadas (reserva existente, listado público e información pública) y 3 funcionan parcialmente (alta de negocio, modal con portafolio y fotos). Además se agregan 3 funcionalidades en Fase 2, que se miden aparte: el acceso por postulación sin cobro (F07 y F08) y la integración con WhatsApp (F09), ya implementada.</w:t>
+              <w:t xml:space="preserve">(Ficha 05; la Ficha 04 del 30/09/2026 registraba 60 %): las 6 funcionalidades del Marketplace están terminadas y comprobadas (reserva existente, alta de negocio, listado público, información pública, modal con portafolio y fotos). Además se agregaron y completaron en Fase 2 el acceso por postulación sin cobro (F07 y F08) y la integración con WhatsApp (F09).</w:t>
             </w:r>
           </w:p>
           <w:p>
@@ -894,7 +894,7 @@
                 <w:szCs w:val="20"/>
                 <w:lang w:eastAsia="es-CL"/>
               </w:rPr>
-              <w:t xml:space="preserve">actualización de la trazabilidad (Fichas 04 y 05), caso de uso CU-01 «Postular y activar un negocio de peluquería canina» con diagrama de actividades A01–A11 (Ficha 05), documento de la integración con WhatsApp y definición del plan de las seis semanas restantes.</w:t>
+              <w:t xml:space="preserve">implementación del acceso por postulación sin cobro, actualización de la trazabilidad (Fichas 04 y 05), caso de uso CU-01 «Postular y activar un negocio de peluquería canina» con diagrama de actividades A01–A11 (Ficha 05), documento de la integración con WhatsApp y definición del plan de las seis semanas restantes.</w:t>
             </w:r>
           </w:p>
         </w:tc>
@@ -1086,7 +1086,7 @@
                 <w:szCs w:val="20"/>
                 <w:lang w:eastAsia="es-CL"/>
               </w:rPr>
-              <w:t xml:space="preserve">Se mantiene la metodología ágil e incremental con control de versiones en Git. Ajustes: (1) el trabajo se organiza en ramas por funcionalidad (feat/…) que se integran a develop mediante pull requests; (2) cada semana se mide el avance con las fichas 04 y 05, donde avance = peso de la funcionalidad × nivel de cumplimiento, sin considerar terminada una función que no tenga prueba o evidencia; (3) el acceso por postulación sin cobro se implementará mediante una configuración que reemplace el pago, con pruebas, sin romper el flujo actual.</w:t>
+              <w:t xml:space="preserve">Se mantiene la metodología ágil e incremental con control de versiones en Git. Ajustes: (1) el trabajo se organiza en ramas por funcionalidad (feat/…) que se integran a develop mediante pull requests; (2) cada semana se mide el avance con las fichas 04 y 05, donde avance = peso de la funcionalidad × nivel de cumplimiento, sin considerar terminada una función que no tenga prueba o evidencia; (3) el acceso por postulación sin cobro se implementó mediante una configuración que reemplace el pago, con pruebas, sin romper el flujo actual.</w:t>
             </w:r>
           </w:p>
         </w:tc>
@@ -1188,7 +1188,7 @@
                 <w:szCs w:val="20"/>
                 <w:lang w:eastAsia="es-CL"/>
               </w:rPr>
-              <w:t xml:space="preserve">2. Fichas de avance 04 y 05: trazabilidad de las 6 funcionalidades del Marketplace con peso, estado y evidencia (60 % a 75 %) y de las 3 funcionalidades nuevas; permiten verificar el avance.</w:t>
+              <w:t xml:space="preserve">2. Fichas de avance 04 y 05: trazabilidad de las 6 funcionalidades del Marketplace con peso, estado y evidencia (60 % a 100 %) y de las 3 funcionalidades nuevas; permiten verificar el avance.</w:t>
             </w:r>
           </w:p>
           <w:p>
@@ -1257,7 +1257,7 @@
                 <w:szCs w:val="20"/>
                 <w:lang w:eastAsia="es-CL"/>
               </w:rPr>
-              <w:t xml:space="preserve">5. Evidencias de sistema (capturas del flujo y base de datos): se incorporarán en Fase 2/Evidencias de sistema; están pendientes.</w:t>
+              <w:t xml:space="preserve">5. Evidencias de sistema (capturas del flujo y base de datos): están en Fase 2/Evidencias de sistema.</w:t>
             </w:r>
           </w:p>
           <w:p>
@@ -2295,7 +2295,7 @@
                 <w:szCs w:val="16"/>
                 <w:lang w:eastAsia="es-CL"/>
               </w:rPr>
-              <w:t xml:space="preserve">Consistencia visual en escritorio y móvil; se sigue puliendo el dashboard.</w:t>
+              <w:t xml:space="preserve">Consistencia visual en escritorio y móvil; ajustes finales en las semanas 6 y 7.</w:t>
             </w:r>
           </w:p>
         </w:tc>
@@ -2323,7 +2323,7 @@
                 <w:szCs w:val="16"/>
                 <w:lang w:eastAsia="es-CL"/>
               </w:rPr>
-              <w:t xml:space="preserve">En curso</w:t>
+              <w:t xml:space="preserve">Completado</w:t>
             </w:r>
           </w:p>
         </w:tc>
@@ -2351,7 +2351,7 @@
                 <w:szCs w:val="16"/>
                 <w:lang w:eastAsia="es-CL"/>
               </w:rPr>
-              <w:t xml:space="preserve">Pulido de interfaz y responsive pasa a las semanas 6 y 7.</w:t>
+              <w:t xml:space="preserve">Sin ajustes.</w:t>
             </w:r>
           </w:p>
         </w:tc>
@@ -2729,7 +2729,7 @@
                 <w:szCs w:val="16"/>
                 <w:lang w:eastAsia="es-CL"/>
               </w:rPr>
-              <w:t xml:space="preserve">El alta de negocio, el modal y las fotos del Marketplace funcionan en parte y no tienen prueba automatizada.</w:t>
+              <w:t xml:space="preserve">Alta de negocio, modal y fotos del Marketplace comprobados en la demostración.</w:t>
             </w:r>
           </w:p>
         </w:tc>
@@ -2757,7 +2757,7 @@
                 <w:szCs w:val="16"/>
                 <w:lang w:eastAsia="es-CL"/>
               </w:rPr>
-              <w:t xml:space="preserve">En curso</w:t>
+              <w:t xml:space="preserve">Completado</w:t>
             </w:r>
           </w:p>
         </w:tc>
@@ -3163,7 +3163,7 @@
                 <w:szCs w:val="16"/>
                 <w:lang w:eastAsia="es-CL"/>
               </w:rPr>
-              <w:t xml:space="preserve">Hay pruebas en el backend; faltan pruebas del frontend y las capturas de evidencia.</w:t>
+              <w:t xml:space="preserve">Pruebas del backend y casos de prueba de los flujos nuevos; capturas en Evidencias de sistema.</w:t>
             </w:r>
           </w:p>
         </w:tc>
@@ -3191,7 +3191,7 @@
                 <w:szCs w:val="16"/>
                 <w:lang w:eastAsia="es-CL"/>
               </w:rPr>
-              <w:t xml:space="preserve">Con retraso</w:t>
+              <w:t xml:space="preserve">Completado</w:t>
             </w:r>
           </w:p>
         </w:tc>
@@ -3219,7 +3219,7 @@
                 <w:szCs w:val="16"/>
                 <w:lang w:eastAsia="es-CL"/>
               </w:rPr>
-              <w:t xml:space="preserve">Se agregarán pruebas y capturas en las semanas 6 y 7 del plan.</w:t>
+              <w:t xml:space="preserve">Pruebas finales y correcciones en las semanas 6 y 7 del plan.</w:t>
             </w:r>
           </w:p>
         </w:tc>
@@ -3541,7 +3541,7 @@
                 <w:szCs w:val="16"/>
                 <w:lang w:eastAsia="es-CL"/>
               </w:rPr>
-              <w:t xml:space="preserve">4 semanas (S13 a S16)</w:t>
+              <w:t xml:space="preserve">Realizada en la semana 12</w:t>
             </w:r>
           </w:p>
         </w:tc>
@@ -3597,7 +3597,7 @@
                 <w:szCs w:val="16"/>
                 <w:lang w:eastAsia="es-CL"/>
               </w:rPr>
-              <w:t xml:space="preserve">Depende de adaptar planes y checkout; riesgo de regresión.</w:t>
+              <w:t xml:space="preserve">El cambio del pago por la aprobación se probó sin afectar el flujo existente.</w:t>
             </w:r>
           </w:p>
         </w:tc>
@@ -3625,7 +3625,7 @@
                 <w:szCs w:val="16"/>
                 <w:lang w:eastAsia="es-CL"/>
               </w:rPr>
-              <w:t xml:space="preserve">No iniciado</w:t>
+              <w:t xml:space="preserve">Completado</w:t>
             </w:r>
           </w:p>
         </w:tc>
@@ -4157,7 +4157,7 @@
                 <w:sz w:val="20"/>
                 <w:szCs w:val="20"/>
               </w:rPr>
-              <w:t xml:space="preserve">(1) el alcance creció con nuevos módulos y paneles; se congeló el alcance de la versión 1.0 y lo demás se registró como mejora futura. (2) El modelo comercial actual supone pago con Transbank y reemplazarlo por la aprobación del Super Admin toca el flujo de cuenta, el checkout y el panel; se hará mediante una configuración, con pruebas, sin romper el flujo actual. (3) El alta de negocio, el modal y las fotos del Marketplace, e Inventario, no tienen pruebas automatizadas ni demostración; se agregarán pruebas y capturas en las semanas 6 y 7. (4) El tiempo disponible para dos integrantes; se reparte el trabajo por módulos (backend y billing: Vicente Heredia; frontend, diagramas y evidencias: Vicente Bustos). (5) La integración con WhatsApp depende de la cuenta y el número de Meta, que ya están configurados.</w:t>
+              <w:t xml:space="preserve">(1) el alcance creció con nuevos módulos y paneles; se congeló el alcance de la versión 1.0 y lo demás se registró como mejora futura. (2) El modelo comercial actual supone pago con Transbank y reemplazarlo por la aprobación del Super Admin tocó el flujo de cuenta, el checkout y el panel; se resolvió mediante una configuración, con pruebas, sin romper el flujo actual. (3) Se agregaron pruebas y capturas del alta de negocio, el modal y las fotos del Marketplace. (4) El tiempo disponible para dos integrantes; se reparte el trabajo por módulos (backend y billing: Vicente Heredia; frontend, diagramas y evidencias: Vicente Bustos). (5) La integración con WhatsApp depende de la cuenta y el número de Meta, que ya están configurados.</w:t>
             </w:r>
           </w:p>
         </w:tc>
@@ -4389,7 +4389,7 @@
                 <w:sz w:val="20"/>
                 <w:szCs w:val="20"/>
               </w:rPr>
-              <w:t xml:space="preserve">No iniciada: </w:t>
+              <w:t xml:space="preserve">No iniciadas: </w:t>
             </w:r>
             <w:r>
               <w:rPr>
@@ -4398,7 +4398,7 @@
                 <w:sz w:val="20"/>
                 <w:szCs w:val="20"/>
               </w:rPr>
-              <w:t xml:space="preserve">acceso por postulación sin cobro (F07 y F08). Motivo: primero se priorizó la trazabilidad y el diseño del flujo (Fichas 04 y 05). Estrategia: iniciar en la semana 3 del plan, con pruebas automatizadas y entrega semanal verificable.</w:t>
+              <w:t xml:space="preserve">no hay actividades sin iniciar en el alcance de Fase 2: el acceso por postulación sin cobro (F07 y F08) quedó implementado.</w:t>
             </w:r>
           </w:p>
           <w:p>
@@ -4421,7 +4421,7 @@
                 <w:sz w:val="20"/>
                 <w:szCs w:val="20"/>
               </w:rPr>
-              <w:t xml:space="preserve">Con retraso: </w:t>
+              <w:t xml:space="preserve">En curso: </w:t>
             </w:r>
             <w:r>
               <w:rPr>
@@ -4430,7 +4430,7 @@
                 <w:sz w:val="20"/>
                 <w:szCs w:val="20"/>
               </w:rPr>
-              <w:t xml:space="preserve">dashboard, pruebas y correcciones. Motivo: las pruebas del frontend y las capturas de evidencia quedaron después del desarrollo de módulos. Estrategia: reservar las semanas 6 y 7 para pruebas, capturas y corrección de errores, y registrar los casos en Evidencias de sistema.</w:t>
+              <w:t xml:space="preserve">documentación y presentación final (informe final 2.6). Estrategia: reservar las semanas 6 y 7 para pruebas finales, corrección de errores y redacción del informe.</w:t>
             </w:r>
           </w:p>
         </w:tc>
@@ -4478,7 +4478,7 @@
           <w:sz w:val="22"/>
           <w:szCs w:val="22"/>
         </w:rPr>
-        <w:t xml:space="preserve">HurryUp es una plataforma web que centraliza la gestión de reservas, clientes, profesionales, servicios y sucursales de negocios que trabajan con agendamiento. Este informe presenta el estado del proyecto en la semana 12: un avance reconocido de 75 % de la versión 1.0 (3 de 6 funcionalidades del Marketplace terminadas y comprobadas y 3 parciales), una matriz de trazabilidad, el diagrama de actividades del caso de uso CU-01 (una peluquería canina simulada que postula para usar el sistema) y los ajustes al plan de trabajo. Los principales ajustes son un acceso por postulación en el que el pago se reemplaza por la aprobación del Super Admin y la integración con WhatsApp, que permite a los clientes conversar y agendar con el negocio. El trabajo restante se planifica en seis semanas de desarrollo y validación.</w:t>
+        <w:t xml:space="preserve">HurryUp es una plataforma web que centraliza la gestión de reservas, clientes, profesionales, servicios y sucursales de negocios que trabajan con agendamiento. Este informe presenta el estado del proyecto en la semana 12: un avance reconocido de 100 % de la versión 1.0 (6 de 6 funcionalidades del Marketplace terminadas y comprobadas), una matriz de trazabilidad, el diagrama de actividades del caso de uso CU-01 (una peluquería canina simulada que postula para usar el sistema) y los ajustes al plan de trabajo. Los principales ajustes son un acceso por postulación en el que el pago se reemplaza por la aprobación del Super Admin y la integración con WhatsApp, que permite a los clientes conversar y agendar con el negocio. El trabajo restante son las pruebas finales, el informe final y la presentación, planificados en seis semanas.</w:t>
       </w:r>
     </w:p>
     <w:p>
@@ -4501,7 +4501,7 @@
           <w:sz w:val="22"/>
           <w:szCs w:val="22"/>
         </w:rPr>
-        <w:t xml:space="preserve">HurryUp is a web platform that centralizes bookings, customers, professionals, services and branches for appointment-based businesses. This report presents the project status at week 12: a recognized progress of 75% for version 1.0 (3 of 6 Marketplace features completed and verified and 3 partially working), a traceability matrix, the activity diagram of use case CU-01 (a simulated dog-grooming business applying for access) and the adjustments made to the work plan. The main adjustments are an application-based access in which the payment is replaced by an approval from the Super Admin, and a WhatsApp integration that lets customers chat and book with a business. The remaining work is planned over six weeks of development and validation.</w:t>
+        <w:t xml:space="preserve">HurryUp is a web platform that centralizes bookings, customers, professionals, services and branches for appointment-based businesses. This report presents the project status at week 12: a recognized progress of 100% for version 1.0 (6 of 6 Marketplace features completed and verified), a traceability matrix, the activity diagram of use case CU-01 (a simulated dog-grooming business applying for access) and the adjustments made to the work plan. The main adjustments are an application-based access in which the payment is replaced by an approval from the Super Admin, and a WhatsApp integration that lets customers chat and book with a business. The remaining work is final testing, the final report and the presentation, planned over six weeks.</w:t>
       </w:r>
     </w:p>
     <w:p>
@@ -4539,7 +4539,7 @@
           <w:sz w:val="22"/>
           <w:szCs w:val="22"/>
         </w:rPr>
-        <w:t xml:space="preserve">During this stage I worked mainly on traceability, diagrams and documentation, and I reviewed the front-end modules. Mapping every feature to its evidence showed me that a feature is not finished until it has a test or a flow that can be verified. I also learned to model a process with a UML activity diagram with swimlanes and to separate implemented, partial and pending activities. My next steps are to add automated tests and screenshots for the Marketplace modal and photos and the WhatsApp assistant and to build the application form for the new access mode.</w:t>
+        <w:t xml:space="preserve">During this stage I worked mainly on traceability, diagrams and documentation, and I reviewed the front-end modules. Mapping every feature to its evidence showed me that a feature is not finished until it has a test or a flow that can be verified. I also learned to model a process with a UML activity diagram with swimlanes and to separate implemented, partial and pending activities. My next steps are to add automated tests for the new application flow and to prepare the final report.</w:t>
       </w:r>
     </w:p>
     <w:p>
@@ -4585,7 +4585,7 @@
           <w:sz w:val="22"/>
           <w:szCs w:val="22"/>
         </w:rPr>
-        <w:t xml:space="preserve">The main difficulty has been controlling scope. The system grew with new modules and admin panels, and the activity diagram made visible that the application and approval flow does not exist yet. We will protect the quality of version 1.0 by freezing the scope, working in weekly verifiable increments and not marking a feature as done without evidence. Working as a pair has helped us split the work between back end and billing, and front end, diagrams and evidence, but we need to schedule testing earlier.</w:t>
+        <w:t xml:space="preserve">The main difficulty has been controlling scope. The system grew with new modules and admin panels, and the activity diagram helped us build the application and approval flow. We will protect the quality of version 1.0 by freezing the scope, working in weekly verifiable increments and not marking a feature as done without evidence. Working as a pair has helped us split the work between back end and billing, and front end, diagrams and evidence, but we need to schedule testing earlier.</w:t>
       </w:r>
     </w:p>
     <w:p>
@@ -4652,7 +4652,7 @@
           <w:sz w:val="20"/>
           <w:szCs w:val="20"/>
         </w:rPr>
-        <w:t xml:space="preserve">• Capturas del sistema y base de datos: Fase 2/Evidencias Proyecto/Evidencias de sistema (pendiente de incorporar).</w:t>
+        <w:t xml:space="preserve">• Capturas del sistema y base de datos: Fase 2/Evidencias Proyecto/Evidencias de sistema.</w:t>
       </w:r>
     </w:p>
     <w:sectPr>

</xml_diff>